<commit_message>
Document CloudFormation deployment and template/Procfile usage; update architecture doc
</commit_message>
<xml_diff>
--- a/SmartSite-Guard-Architecture.docx
+++ b/SmartSite-Guard-Architecture.docx
@@ -242,6 +242,39 @@
     <w:p>
       <w:r>
         <w:t>Proximity: Supports presence detection or object movement in the monitored zone, useful for access control and safety.</w:t>
+      </w:r>
+    </w:p>
+    <w:p>
+      <w:pPr>
+        <w:pStyle w:val="Heading2"/>
+      </w:pPr>
+      <w:r>
+        <w:t>Deployment and CloudFormation</w:t>
+      </w:r>
+    </w:p>
+    <w:p>
+      <w:r>
+        <w:t>The project includes cloud deployment artifacts that define infrastructure as code and automate stack deployment.</w:t>
+      </w:r>
+    </w:p>
+    <w:p>
+      <w:r>
+        <w:t>The `cloud/template.yaml` file is an AWS CloudFormation template. It describes AWS resources and dependencies so the application infrastructure can be created in a repeatable, managed way.</w:t>
+      </w:r>
+    </w:p>
+    <w:p>
+      <w:r>
+        <w:t>The `cloud/deploy.ps1` script runs the AWS CLI deploy command against the CloudFormation template. It is used to create or update the stack from the repository.</w:t>
+      </w:r>
+    </w:p>
+    <w:p>
+      <w:r>
+        <w:t>The `dashboard/Procfile` is a process startup definition. Hosting platforms use it to know how to start the Flask dashboard application.</w:t>
+      </w:r>
+    </w:p>
+    <w:p>
+      <w:r>
+        <w:t>This deployment model separates local runtime behavior from cloud infrastructure provisioning, allowing developers to test locally and deploy reliably when needed.</w:t>
       </w:r>
     </w:p>
     <w:p>

</xml_diff>